<commit_message>
Response letter DK_5: line numbers read from Word's own PDF
DK_4's references were taken from a LibreOffice render, whose line breaks
drift 1-3 lines from Word's by the second half of the paper. DK_5 locates
the same cited passages on the line numbers of a PDF the author exported
from Word, so they match what reviewers see. Only line references change;
ranges the author had already widened by hand are kept where they still
cover the passage. The author's updated DK_3 manuscript, its Word PDF and
the hand-corrected DK_4 letter replace the earlier copies as the record.

Co-Authored-By: Claude Opus 5.5 <noreply@anthropic.com>
Claude-Session: https://claude.ai/code/session_012Y6rAWcwNN47iygCbbLxQR
</commit_message>
<xml_diff>
--- a/manuscript/revised/Response_to_Reviewers_DK_4.docx
+++ b/manuscript/revised/Response_to_Reviewers_DK_4.docx
@@ -243,7 +243,31 @@
         <w:commentReference w:id="3"/>
       </w:r>
       <w:r>
-        <w:t>) than our own (Irish pasture-based sheep of multiple breeds), which alone would be expected to produce some difference in heritability estimates. The corresponding repeatability under this model is 0.32 (Table 2). The full re-analysis is described in the Methods, with further supporting detail in Supplementary Material S1. [Revised manuscript, lines 170–171, 213–223, 335–337, 475–484.]</w:t>
+        <w:t>) than our own (Irish pasture-based sheep of multiple breeds), which alone would be expected to produce some difference in heritability estimates. The corresponding repeatability under this model is 0.32 (Table 2). The full re-analysis is described in the Methods, with further supporting detail in Supplementary Material S1. [Revised manuscript, lines 17</w:t>
+      </w:r>
+      <w:r>
+        <w:t>1</w:t>
+      </w:r>
+      <w:r>
+        <w:t>–17</w:t>
+      </w:r>
+      <w:r>
+        <w:t>2</w:t>
+      </w:r>
+      <w:r>
+        <w:t>, 213–223, 33</w:t>
+      </w:r>
+      <w:r>
+        <w:t>6</w:t>
+      </w:r>
+      <w:r>
+        <w:t>–33</w:t>
+      </w:r>
+      <w:r>
+        <w:t>8</w:t>
+      </w:r>
+      <w:r>
+        <w:t>, 475–484.]</w:t>
       </w:r>
     </w:p>
     <w:p>
@@ -310,7 +334,43 @@
         <w:commentReference w:id="4"/>
       </w:r>
       <w:r>
-        <w:t>. We have added carbon dioxide as a fully reported trait throughout the paper: a means/SD/range entry in the descriptive-statistics table, its own row in the genetic-parameters table, and its genetic and phenotypic correlations with methane and metabolic body weight, addressing the reviewer's point that no units or descriptive table were previously given for CO2. [Revised manuscript, lines 165–166, 170–171, 289–290.]</w:t>
+        <w:t>. We have added carbon dioxide as a fully reported trait throughout the paper: a means/SD/range entry in the descriptive-statistics table, its own row in the genetic-parameters table, and its genetic and phenotypic correlations with methane and metabolic body weight, addressing the reviewer's point that no units or descriptive table were previously given for CO2. [Revised manuscript, lines 16</w:t>
+      </w:r>
+      <w:r>
+        <w:t>6</w:t>
+      </w:r>
+      <w:r>
+        <w:t>–16</w:t>
+      </w:r>
+      <w:r>
+        <w:t>7</w:t>
+      </w:r>
+      <w:r>
+        <w:t>, 17</w:t>
+      </w:r>
+      <w:r>
+        <w:t>1</w:t>
+      </w:r>
+      <w:r>
+        <w:t>–17</w:t>
+      </w:r>
+      <w:r>
+        <w:t>2</w:t>
+      </w:r>
+      <w:r>
+        <w:t>, 2</w:t>
+      </w:r>
+      <w:r>
+        <w:t>90</w:t>
+      </w:r>
+      <w:r>
+        <w:t>–29</w:t>
+      </w:r>
+      <w:r>
+        <w:t>1</w:t>
+      </w:r>
+      <w:r>
+        <w:t>.]</w:t>
       </w:r>
     </w:p>
     <w:p>
@@ -335,10 +395,53 @@
         <w:t>Response:</w:t>
       </w:r>
       <w:r>
-        <w:t xml:space="preserve"> We accept the reviewer's point that this should be included. A Wald F-statistic table of fixed-effect significance for every trait, together with pedigree completeness and connectedness diagnostics, is now provided in Supplementary Material S1, and the confounding between breed and contemporary group is now described in the Results: Texel and Suffolk proportions varied substantially within contemporary groups, whereas Cheviot and Lleyn proportions were largely confined to particular contemporary groups, so their breed effects cannot be cleanly separated from contemporary-</w:t>
-      </w:r>
-      <w:r>
-        <w:t>group effects. The proportion of phenotypic variance accounted for by breed was calculated from each univariate model's breed-proportion solutions: it was below 1% for the methane traits recorded on all animals, and 0.2–10% for those recorded on the ADG and CT subsets, compared with 3% for MBW. As breed effects were estimated conditional on contemporary group, these values exclude any breed variation absorbed by the contemporary-group effects. Most contemporary groups (82.1%) contained a single sex. On reflection following the reviewer's comments, we also trimmed the pedigree to the direct ancestors of phenotyped animals only, as we believe this is more appropriate for a parameter-estimation study than a larger, sparser pedigree carrying many animals with no phenotyped descendants. [Revised manuscript, lines 185–190, 197, 280–285, 603–604, 610.]</w:t>
+        <w:t xml:space="preserve"> We accept the reviewer's point that this should be included. A Wald F-statistic table of fixed-effect significance for every trait, together with pedigree completeness and connectedness diagnostics, is now provided in Supplementary Material S1, and the confounding between breed and contemporary group is now described in the Results: Texel and Suffolk proportions varied substantially within contemporary groups, whereas Cheviot and Lleyn proportions were largely confined to particular contemporary groups, so their breed effects cannot be cleanly separated from contemporary-group effects. The proportion of phenotypic variance accounted for by breed was calculated from each univariate model's breed-proportion solutions: it was below 1% for the methane traits recorded on all animals, and 0.2–</w:t>
+      </w:r>
+      <w:r>
+        <w:lastRenderedPageBreak/>
+        <w:t>10% for those recorded on the ADG and CT subsets, compared with 3% for MBW. As breed effects were estimated conditional on contemporary group, these values exclude any breed variation absorbed by the contemporary-group effects. Most contemporary groups (82.1%) contained a single sex. On reflection following the reviewer's comments, we also trimmed the pedigree to the direct ancestors of phenotyped animals only, as we believe this is more appropriate for a parameter-estimation study than a larger, sparser pedigree carrying many animals with no phenotyped descendants. [Revised manuscript, lines 185–19</w:t>
+      </w:r>
+      <w:r>
+        <w:t>1</w:t>
+      </w:r>
+      <w:r>
+        <w:t>, 19</w:t>
+      </w:r>
+      <w:r>
+        <w:t>8</w:t>
+      </w:r>
+      <w:r>
+        <w:t>, 28</w:t>
+      </w:r>
+      <w:r>
+        <w:t>1</w:t>
+      </w:r>
+      <w:r>
+        <w:t>–28</w:t>
+      </w:r>
+      <w:r>
+        <w:t>6</w:t>
+      </w:r>
+      <w:r>
+        <w:t>, 60</w:t>
+      </w:r>
+      <w:r>
+        <w:t>6</w:t>
+      </w:r>
+      <w:r>
+        <w:t>–60</w:t>
+      </w:r>
+      <w:r>
+        <w:t>7</w:t>
+      </w:r>
+      <w:r>
+        <w:t>, 61</w:t>
+      </w:r>
+      <w:r>
+        <w:t>3</w:t>
+      </w:r>
+      <w:r>
+        <w:t>.]</w:t>
       </w:r>
     </w:p>
     <w:p>
@@ -363,7 +466,13 @@
         <w:t>Response:</w:t>
       </w:r>
       <w:r>
-        <w:t xml:space="preserve"> Corrected; the model equation now explicitly includes the residual term (+ e). [Revised manuscript, line 193.]</w:t>
+        <w:t xml:space="preserve"> Corrected; the model equation now explicitly includes the residual term (+ e). [Revised manuscript, line 19</w:t>
+      </w:r>
+      <w:r>
+        <w:t>4</w:t>
+      </w:r>
+      <w:r>
+        <w:t>.]</w:t>
       </w:r>
     </w:p>
     <w:p>
@@ -388,10 +497,53 @@
         <w:t>Response:</w:t>
       </w:r>
       <w:r>
-        <w:t xml:space="preserve"> This is correct, and we thank the reviewer for raising it. We have now tested directly whether a single combined analysis across growing and mature animals is appropriate. Residual variance heterogeneity across contemporary-group-mean classes was fitted for the methane traits with sufficient data spanning multiple stages; this is described in the Methods and Discussion. We also fitted a model in which residual variance differed by physiological stage but, on reflection, chose contemporary-group-mean classes instead, because residual variance </w:t>
-      </w:r>
-      <w:r>
-        <w:t>in methane traits tends to scale with the mean, and contemporary-group means vary widely within as well as between stages (e.g. with season, diet and measurement date). Grouping residuals by contemporary-group mean therefore captures this scale effect more fully, while still largely absorbing the stage difference, as contemporary groups are largely stage-specific. Where the heterogeneous-residual model converged (five of the nine methane traits), its heritability and repeatability estimates are now the ones reported in Table 2. For the reviewer’s information, the corresponding heritabilities (SE) under a single homogeneous residual variance were 0.25 (0.02) for CH4, 0.19 (0.02) for CH4/MBW, 0.10 (0.01) for CH4 ratio, 0.18 (0.02) for RMTMBW and 0.18 (0.02) for RMTMBW+CO2; the genetic correlations remain from homogeneous-residual bivariate models, as a heterogeneous-residual bivariate model was not estimable. We also estimated the genetic correlation between methane production measured on growing animals and on mature animals, treated as two separate but genetically linked traits; this bivariate genetic correlation was 0.99, indicating that, genetically, methane production in young and old animals is essentially the same trait, which supports the appropriateness of the combined analysis. [Revised manuscript, lines 213–223, 509–522.]</w:t>
+        <w:t xml:space="preserve"> This is correct, and we thank the reviewer for raising it. We have now tested directly whether a single combined analysis across growing and mature animals is appropriate. Residual variance heterogeneity across contemporary-group-mean classes was fitted for the methane traits with sufficient data spanning multiple stages; this is described in the Methods and Discussion. We also fitted a model in which residual variance differed by physiological stage but, on reflection, chose contemporary-group-mean classes instead, because residual variance in methane traits tends to scale with the mean, and contemporary-group means vary widely within as well as between stages (e.g. with season, diet and measurement date). Grouping residuals by contemporary-group mean therefore captures this scale effect more fully, while </w:t>
+      </w:r>
+      <w:r>
+        <w:lastRenderedPageBreak/>
+        <w:t>still largely absorbing the stage difference, as contemporary groups are largely stage-specific. Where the heterogeneous-residual model converged (five of the nine methane traits), its heritability and repeatability estimates are now the ones reported in Table 2. For the reviewer’s information, the corresponding heritabilities (SE) under a single homogeneous residual variance were 0.25 (0.02) for CH4, 0.19 (0.02) for CH4/MBW, 0.10 (0.01) for CH4 ratio, 0.18 (0.02) for RMT</w:t>
+      </w:r>
+      <w:r>
+        <w:rPr>
+          <w:vertAlign w:val="subscript"/>
+        </w:rPr>
+        <w:t>MBW</w:t>
+      </w:r>
+      <w:r>
+        <w:t xml:space="preserve"> and 0.18 (0.02) for RMT</w:t>
+      </w:r>
+      <w:r>
+        <w:rPr>
+          <w:vertAlign w:val="subscript"/>
+        </w:rPr>
+        <w:t>MBW+CO2</w:t>
+      </w:r>
+      <w:r>
+        <w:t>; the genetic correlations remain from homogeneous-residual bivariate models, as a heterogeneous-residual bivariate model was not estimable. We also estimated the genetic correlation between methane production measured on growing animals and on mature animals, treated as two separate but genetically linked traits; this bivariate genetic correlation was 0.99, indicating that, genetically, methane production in young and old animals is essentially the same trait, which supports the appropriateness of the combined analysis. [Revised manuscript, lines 21</w:t>
+      </w:r>
+      <w:r>
+        <w:t>5</w:t>
+      </w:r>
+      <w:r>
+        <w:t>–22</w:t>
+      </w:r>
+      <w:r>
+        <w:t>4</w:t>
+      </w:r>
+      <w:r>
+        <w:t>, 5</w:t>
+      </w:r>
+      <w:r>
+        <w:t>11</w:t>
+      </w:r>
+      <w:r>
+        <w:t>–52</w:t>
+      </w:r>
+      <w:r>
+        <w:t>8</w:t>
+      </w:r>
+      <w:r>
+        <w:t>.]</w:t>
       </w:r>
     </w:p>
     <w:p>
@@ -416,51 +568,72 @@
         <w:t>Response:</w:t>
       </w:r>
       <w:r>
-        <w:t xml:space="preserve"> This is now addressed throughout: the discrepancy with Jonker et al. is discussed explicitly (see above and the Discussion section), and substantially more detail on </w:t>
-      </w:r>
+        <w:t xml:space="preserve"> This is now addressed throughout: the discrepancy with Jonker et al. is discussed explicitly (see above and the Discussion section), and substantially more detail on how the genetic-parameter analysis was conducted is now given in the Methods and Supplementary Material S1. Table 3 now reports the genetic and phenotypic correlations of CO2 and of each alternative definition with daily methane from the re-estimated models; the correlations among </w:t>
+      </w:r>
+      <w:r>
+        <w:lastRenderedPageBreak/>
+        <w:t>the alternative definitions themselves were not re-estimated and have been removed. [Revised manuscript, lines 280–28</w:t>
+      </w:r>
+      <w:r>
+        <w:t>6</w:t>
+      </w:r>
+      <w:r>
+        <w:t>, 47</w:t>
+      </w:r>
+      <w:r>
+        <w:t>8</w:t>
+      </w:r>
+      <w:r>
+        <w:t>–48</w:t>
+      </w:r>
+      <w:r>
+        <w:t>7</w:t>
+      </w:r>
+      <w:r>
+        <w:t>, 60</w:t>
+      </w:r>
+      <w:r>
+        <w:t>6</w:t>
+      </w:r>
+      <w:r>
+        <w:t>–60</w:t>
+      </w:r>
+      <w:r>
+        <w:t>8</w:t>
+      </w:r>
+      <w:r>
+        <w:t>, 61</w:t>
+      </w:r>
+      <w:r>
+        <w:t>3</w:t>
+      </w:r>
+      <w:r>
+        <w:t>.]</w:t>
+      </w:r>
+    </w:p>
+    <w:p>
+      <w:pPr>
+        <w:jc w:val="both"/>
+      </w:pPr>
+      <w:r>
+        <w:rPr>
+          <w:i/>
+        </w:rPr>
+        <w:t>The second issue relates to the selection of alternative methane trait definitions, including residual trait definitions. These on the surface appear arbitrary, but in fact, all they are doing are trying to correct for differences in feed intake using “proxy traits” as feed intake has not been measured. It is the amount of methane produced per unit feed intake and the amount of production per unit of feed intake that most closely relates to the question at hand “how can I maximise production of lamb carcass weight per hectare while reducing methane emissions” I feel this aspect has been not directly confronted, because there is an important additional caveat: around 70% of the feed is used in ewe maintenance and reproduction and only 30% in lamb carcass production. So increased fecundity, ewe longevity and lamb survival and associated traits relationship with methane traits are probably more important than liveweight or average daily gain in an enterprise's bio-economic analysis.</w:t>
+      </w:r>
+    </w:p>
+    <w:p>
+      <w:pPr>
+        <w:jc w:val="both"/>
+      </w:pPr>
       <w:commentRangeStart w:id="5"/>
       <w:r>
-        <w:t>how the genetic-parameter analysis was conducted</w:t>
+        <w:rPr>
+          <w:b/>
+        </w:rPr>
+        <w:t>Response</w:t>
       </w:r>
       <w:commentRangeEnd w:id="5"/>
-      <w:r>
-        <w:rPr>
-          <w:rStyle w:val="CommentReference"/>
-          <w:sz w:val="24"/>
-          <w:szCs w:val="22"/>
-        </w:rPr>
-        <w:commentReference w:id="5"/>
-      </w:r>
-      <w:r>
-        <w:t xml:space="preserve"> is now given in the Methods and Supplementary </w:t>
-      </w:r>
-      <w:r>
-        <w:t>Material S1. Table 3 now reports the genetic and phenotypic correlations of CO2 and of each alternative definition with daily methane from the re-estimated models; the correlations among the alternative definitions themselves were not re-estimated and have been removed. [Revised manuscript, lines 280–281, 475–484, 603–604, 610.]</w:t>
-      </w:r>
-    </w:p>
-    <w:p>
-      <w:pPr>
-        <w:jc w:val="both"/>
-      </w:pPr>
-      <w:r>
-        <w:rPr>
-          <w:i/>
-        </w:rPr>
-        <w:t>The second issue relates to the selection of alternative methane trait definitions, including residual trait definitions. These on the surface appear arbitrary, but in fact, all they are doing are trying to correct for differences in feed intake using “proxy traits” as feed intake has not been measured. It is the amount of methane produced per unit feed intake and the amount of production per unit of feed intake that most closely relates to the question at hand “how can I maximise production of lamb carcass weight per hectare while reducing methane emissions” I feel this aspect has been not directly confronted, because there is an important additional caveat: around 70% of the feed is used in ewe maintenance and reproduction and only 30% in lamb carcass production. So increased fecundity, ewe longevity and lamb survival and associated traits relationship with methane traits are probably more important than liveweight or average daily gain in an enterprise's bio-economic analysis.</w:t>
-      </w:r>
-    </w:p>
-    <w:p>
-      <w:pPr>
-        <w:jc w:val="both"/>
-      </w:pPr>
-      <w:commentRangeStart w:id="6"/>
-      <w:r>
-        <w:rPr>
-          <w:b/>
-        </w:rPr>
-        <w:t>Response</w:t>
-      </w:r>
-      <w:commentRangeEnd w:id="6"/>
       <w:r>
         <w:rPr>
           <w:rStyle w:val="CommentReference"/>
@@ -468,7 +641,7 @@
           <w:sz w:val="24"/>
           <w:szCs w:val="22"/>
         </w:rPr>
-        <w:commentReference w:id="6"/>
+        <w:commentReference w:id="5"/>
       </w:r>
       <w:r>
         <w:rPr>
@@ -477,26 +650,90 @@
         <w:t>:</w:t>
       </w:r>
       <w:r>
-        <w:t xml:space="preserve"> We accept the reviewer’s point. The ratio and residual definitions are, in effect, proxies for feed-intake information that this dataset does not contain. The biological rationale for each definition, including the intake information it stands in for, is now set out in the Background and Discussion. CO2, which reflects total metabolic activity and is more directly linked to intake than growth rate, is now reported as a trait in its own right and is used, rather than ADG, as the intake proxy in the selection index. The Discussion also notes that the residual traits remain strongly genetically correlated with absolute methane (0.78–1.00), so they are not genetically independent of the traits they are adjusted for. We agree that a full bio-economic analysis would need to weigh feed intake per unit of production directly and that, as roughly 70% of ewe flock feed supports ewe maintenance and reproduction, fecundity, ewe longevity </w:t>
-      </w:r>
-      <w:r>
-        <w:t xml:space="preserve">and lamb survival are likely to be at least as important as the body-size and growth traits examined here. The selection index analysis is not intended as such a breeding objective: it includes no feed intake, fecundity, longevity or survival traits and no economic values. Its narrower aim, now stated in the Abstract, Background and Discussion, is to examine how absolute, ratio and residual methane traits behave within an index. It shows that a ratio or residual trait is, in effect, a fixed weighting of methane against body size, and that a favourable region, in which methane is reduced without a decline in MBW or CO2, exists (Figure 1) and can be reached from any of the methane traits once MBW and CO2 are weighted appropriately (Table 6). In line with the reviewer’s point on feed cost, the reference index holds CO2 at zero response, so that methane is not reduced simply by favouring animals that </w:t>
-      </w:r>
-      <w:commentRangeStart w:id="7"/>
+        <w:t xml:space="preserve"> We accept the reviewer’s point. The ratio and residual definitions are, in effect, proxies for feed-intake information that this dataset does not contain. The biological rationale for each definition, including the intake information it stands in for, is now set out in the Background and Discussion. CO2, which reflects total metabolic activity and is more directly linked to intake than growth rate, is now reported as a trait in its own right and is used, rather than ADG, as the intake proxy in the selection index. The </w:t>
+      </w:r>
+      <w:r>
+        <w:t>d</w:t>
+      </w:r>
+      <w:r>
+        <w:t xml:space="preserve">iscussion also notes that the residual traits remain strongly genetically correlated with absolute methane (0.78–1.00), so they are not genetically independent of the traits they are adjusted for. We agree that a full bio-economic analysis would need to weigh feed intake per unit of production directly and that, as roughly 70% of ewe flock feed supports ewe maintenance and reproduction, fecundity, ewe longevity and lamb survival are likely to be at least as important as the body-size and growth traits examined here. The selection index analysis is not intended as such a breeding objective: it </w:t>
+      </w:r>
+      <w:r>
+        <w:lastRenderedPageBreak/>
+        <w:t>includes no feed intake, fecundity, longevity or survival traits and no economic values. Its narrower aim, now stated in the Abstract, Background and Discussion, is to examine how absolute, ratio and residual methane traits behave within an index. It shows that a ratio or residual trait is, in effect, a fixed weighting of methane against body size, and that a favourable region, in which methane is reduced without a decline in MBW or CO2, exists (Figure 1) and can be reached from any of the methane traits once MBW and CO2 are weighted appropriately (Table 6). In line with the reviewer’s point on feed cost, the reference index holds CO2</w:t>
+      </w:r>
+      <w:r>
+        <w:t xml:space="preserve"> (CO2 act</w:t>
+      </w:r>
+      <w:r>
+        <w:t>ing as a proxy for feed intake)</w:t>
+      </w:r>
+      <w:r>
+        <w:t xml:space="preserve"> at zero response, so that methane is not reduced simply by favouring animals that </w:t>
+      </w:r>
+      <w:commentRangeStart w:id="6"/>
       <w:r>
         <w:t>eat less</w:t>
       </w:r>
-      <w:commentRangeEnd w:id="7"/>
+      <w:commentRangeEnd w:id="6"/>
       <w:r>
         <w:rPr>
           <w:rStyle w:val="CommentReference"/>
           <w:sz w:val="24"/>
           <w:szCs w:val="22"/>
         </w:rPr>
-        <w:commentReference w:id="7"/>
-      </w:r>
-      <w:r>
-        <w:t>. [Revised manuscript, lines 429–433, 460–474, 502–507, 532–535, 540–557.]</w:t>
+        <w:commentReference w:id="6"/>
+      </w:r>
+      <w:r>
+        <w:t>. [Revised manuscript, lines 4</w:t>
+      </w:r>
+      <w:r>
+        <w:t>31</w:t>
+      </w:r>
+      <w:r>
+        <w:t>–43</w:t>
+      </w:r>
+      <w:r>
+        <w:t>6</w:t>
+      </w:r>
+      <w:r>
+        <w:t>, 46</w:t>
+      </w:r>
+      <w:r>
+        <w:t>3</w:t>
+      </w:r>
+      <w:r>
+        <w:t>–474, 502–5</w:t>
+      </w:r>
+      <w:r>
+        <w:t>10</w:t>
+      </w:r>
+      <w:r>
+        <w:t>, 53</w:t>
+      </w:r>
+      <w:r>
+        <w:t>5</w:t>
+      </w:r>
+      <w:r>
+        <w:t>–53</w:t>
+      </w:r>
+      <w:r>
+        <w:t>8</w:t>
+      </w:r>
+      <w:r>
+        <w:t>, 54</w:t>
+      </w:r>
+      <w:r>
+        <w:t>3</w:t>
+      </w:r>
+      <w:r>
+        <w:t>–5</w:t>
+      </w:r>
+      <w:r>
+        <w:t>60</w:t>
+      </w:r>
+      <w:r>
+        <w:t>.]</w:t>
       </w:r>
     </w:p>
     <w:p>
@@ -507,14 +744,14 @@
         <w:rPr>
           <w:i/>
         </w:rPr>
-        <w:t xml:space="preserve">The final issue relates to the use of the smith-hazel index theory used and this has two facets. The first is in several places the authors talk about progress per generation, but as far as I can understand from the paper (line 243, this actually equates to a selection intensity of i=1). I have no problem with this but would suggest the authors be more explicit throughout. In practice in sheep, the selection intensity per generation is likely to be closer to 1.7 and the generation length around 2.8 years. The second aspect that is not acknowledged in the paper is that in a real flock, not all animals may be measured for all traits, measurements may differ between sexes, and progeny, and genomics may or may not or only partially be used and if it is used the accuracy of the breeding values differ as well. The impacts of this are not explored here, and that is okay, but there does need to be acknowledgement along with references that these are real issues in practice and you cannot simply extrapolate from the graphs presented to a real world situation. The final aspect is that the use of Smith-Hazel index theory is at best an approximation and this is explored in Cuyabano, Beatriz C. D., Mariana R. Motta, Jeremie Vandenplas, Nancy L. Garcia, Fatima Shokor, Pascal Croiseau, Didier Boichard, Sophie </w:t>
+        <w:t xml:space="preserve">The final issue relates to the use of the smith-hazel index theory used and this has two facets. The first is in several places the authors talk about progress per generation, but as far as I can understand from the paper (line 243, this actually equates to a selection intensity of i=1). I have no problem with this but would suggest the authors be more explicit throughout. In practice in sheep, the selection intensity per generation is likely to be closer to 1.7 and the generation length around 2.8 years. The second aspect that is not acknowledged in the paper is that in a real flock, not all animals may be measured for all traits, measurements may differ between sexes, and progeny, and genomics may or may not or only partially be used and if it is used the accuracy of the breeding values differ as well. The impacts of this are not explored here, and that is okay, but there does need to be acknowledgement along with references that these are real issues in practice and you cannot simply extrapolate from the graphs presented to a real world situation. The final aspect is that the use of Smith-Hazel index theory is at best an approximation and this is explored in Cuyabano, Beatriz C. D., Mariana R. Motta, Jeremie Vandenplas, Nancy L. Garcia, Fatima Shokor, Pascal Croiseau, Didier Boichard, Sophie Aguerre, and Sophie Mattalia. 2025. “Trajectories of Genetic Correlations in Populations </w:t>
       </w:r>
       <w:r>
         <w:rPr>
           <w:i/>
         </w:rPr>
         <w:lastRenderedPageBreak/>
-        <w:t>Aguerre, and Sophie Mattalia. 2025. “Trajectories of Genetic Correlations in Populations under Selection: From Theory to a Case-Study.” bioRxiv. https://doi.org/10.1101/2025.03.13.643026. There needs to be some caveats and a reference to this work, as this issue is becoming more important with the use of genomics.</w:t>
+        <w:t>under Selection: From Theory to a Case-Study.” bioRxiv. https://doi.org/10.1101/2025.03.13.643026. There needs to be some caveats and a reference to this work, as this issue is becoming more important with the use of genomics.</w:t>
       </w:r>
     </w:p>
     <w:p>
@@ -552,7 +789,13 @@
         <w:jc w:val="both"/>
       </w:pPr>
       <w:r>
-        <w:t>3. Approximation: we cite Cuyabano et al. (2025) [61] and state that the genetic parameters were treated as constant across generations, whereas they change under selection. We now propagate the sampling uncertainty of the parameter estimates into the index results by Monte Carlo simulation: the 15 (co)variance parameters of the trivariate model were resampled jointly (10,000 draws) from a multivariate normal distribution using their REML estimates and sampling (co)variance matrix, and results are reported with 95% intervals (Methods). We also state that the weights reported are specific to the parameters estimated in this population and should not be generalised.</w:t>
+        <w:t>3. Approximation: we cite Cuyabano et al. (2025) [61] and state that the genetic parameters were treated as constant across generations, whereas they change under selection. We</w:t>
+      </w:r>
+      <w:r>
+        <w:t xml:space="preserve"> do</w:t>
+      </w:r>
+      <w:r>
+        <w:t xml:space="preserve"> propagate the sampling uncertainty of the parameter estimates into the index results by Monte Carlo simulation: the 15 (co)variance parameters of the trivariate model were resampled jointly (10,000 draws) from a multivariate normal distribution using their REML estimates and sampling (co)variance matrix, and results are reported with 95% intervals (Methods). We also state that the weights reported are specific to the parameters estimated in this population and should not be generalised.</w:t>
       </w:r>
     </w:p>
     <w:p>
@@ -560,7 +803,11 @@
         <w:jc w:val="both"/>
       </w:pPr>
       <w:r>
-        <w:t>4. Scope: the analysis is not intended as a large, sophisticated index simulation or a national breeding index. It is a deliberately narrow, detailed investigation of how methane traits behave within an index, and the simplifying assumptions above follow from that aim. Within this scope, we believe the conclusions on the relative behaviour of absolute, ratio and residual methane traits hold, even though the absolute responses should not be read as predictions for a real breeding programme.</w:t>
+        <w:t xml:space="preserve">4. Scope: the analysis is not intended as a large, sophisticated index simulation or a national breeding index. It is a deliberately narrow, detailed investigation of how methane traits behave </w:t>
+      </w:r>
+      <w:r>
+        <w:lastRenderedPageBreak/>
+        <w:t>within an index, and the simplifying assumptions above follow from that aim. Within this scope, we believe the conclusions on the relative behaviour of absolute, ratio and residual methane traits hold, even though the absolute responses should not be read as predictions for a real breeding programme.</w:t>
       </w:r>
     </w:p>
     <w:p>
@@ -594,10 +841,11 @@
         <w:t>Response:</w:t>
       </w:r>
       <w:r>
-        <w:t xml:space="preserve"> We thank the reviewer for this point and agree the original submission did not explain the biological rationale for the residual and ratio trait definitions, including regressing methane on CO2 production. We have kept the Methods section focused on describing the approach taken (how each trait was constructed), and have placed the biological rationale for these trait definitions in the Background and Discussion sections instead. We have also now included CO2 as a trait in its own right throughout the analysis: descriptive statistics, heritability and genetic standard deviation, and its genetic and phenotypic correlations with methane and metabolic body weight are all now reported, along with a biological interpretation </w:t>
-      </w:r>
-      <w:r>
-        <w:t>of what these relationships suggest about the animals' overall energy metabolism. CO2 is also included in the selection index analysis, both as a recorded trait and in the breeding goal; CH4 ratio, which when linearised gives the same breeding-goal direction as CH4/CO2, is among the methane traits examined in the index (Table 6). We use CO2 as a proxy for feed intake, while recognising that it is not a validated measure of intake. [Revised manuscript, lines 165–166, 319–321, 349–350, 460–474, 502–507.]</w:t>
+        <w:t xml:space="preserve"> We thank the reviewer for this point and agree the original submission did not explain the biological rationale for the residual and ratio trait definitions, including regressing methane on CO2 production. We have kept the Methods section focused on describing the approach taken (how each trait was constructed), and have placed the biological rationale for these trait definitions in the Background and Discussion sections instead. We have also now included CO2 as a trait in its own right throughout the analysis: descriptive statistics, heritability and genetic standard deviation, and its genetic and phenotypic correlations with methane and metabolic body weight are all now reported, along with a biological interpretation of what these relationships suggest about the animals' overall energy metabolism. CO2 is also included in the selection index analysis, both as a recorded trait and in the breeding goal; CH4 </w:t>
+      </w:r>
+      <w:r>
+        <w:lastRenderedPageBreak/>
+        <w:t>ratio, which when linearised gives the same breeding-goal direction as CH4/CO2, is among the methane traits examined in the index (Table 6). We use CO2 as a proxy for feed intake, while recognising that it is not a validated measure of intake. [Revised manuscript, lines 165–166, 319–321, 349–350, 460–474, 502–507.]</w:t>
       </w:r>
     </w:p>
     <w:p>
@@ -624,24 +872,25 @@
       <w:r>
         <w:t xml:space="preserve"> The pros and cons of the PAC method for this study are now discussed in the Background. In brief, PACs are portable, quick (about one hour per measurement) and </w:t>
       </w:r>
-      <w:commentRangeStart w:id="8"/>
+      <w:commentRangeStart w:id="7"/>
       <w:r>
         <w:t>relatively low cost per phenotype</w:t>
       </w:r>
-      <w:commentRangeEnd w:id="8"/>
+      <w:commentRangeEnd w:id="7"/>
       <w:r>
         <w:rPr>
           <w:rStyle w:val="CommentReference"/>
           <w:sz w:val="24"/>
           <w:szCs w:val="22"/>
         </w:rPr>
-        <w:commentReference w:id="8"/>
-      </w:r>
-      <w:r>
-        <w:t xml:space="preserve">, so large numbers of animals can be measured on farm under commercial pasture-based conditions, which is what makes a genetic evaluation of this size feasible; PAC measurements are also repeatable and related to respiration-chamber measurements. Their main limitation is that each record is a short snapshot taken off pasture, rather than a full 24-hour measurement, so it is sensitive to time since feeding and diurnal variation, and it does not capture feed intake directly. PAC records therefore rank animals for methane output, but do not give an exact daily emission for each animal. On the reviewer's point about the generally small number of repeated records per animal: we acknowledge this as a real limitation of the dataset and now state this explicitly. At the same time, we believe it remains important to account for a permanent environmental effect in the model even with a modest proportion of repeated records, given the amount of occasion-to-occasion variability observed in methane measurements; omitting it would risk attributing repeatable but non-genetic variation to the additive genetic variance. We report repeatability alongside heritability for every trait for which the permanent environmental variance could be estimated and note </w:t>
-      </w:r>
-      <w:r>
-        <w:t>directly in the results where it could not (itself a further indication of how sparse repeated records limit what can be estimated for some of the smaller trait subsets, such as the CT-derived traits). [Revised manuscript, lines 66–73, 522–525.]</w:t>
+        <w:commentReference w:id="7"/>
+      </w:r>
+      <w:r>
+        <w:t xml:space="preserve">, so large numbers of animals can be measured on farm under commercial pasture-based conditions, which is what makes a genetic evaluation of this size feasible; PAC measurements are also repeatable and related to respiration-chamber measurements. Their main limitation is that each record is a short snapshot taken off pasture, rather than a full 24-hour measurement, so it is sensitive to time since feeding and diurnal variation, and it does not capture feed intake directly. PAC records therefore rank animals for methane output, but do not give an exact daily emission for each animal. On the reviewer's point about the generally small number of repeated records per animal: we acknowledge this as limitation of the dataset and now state this explicitly. At the same time, we believe it remains important to account for a permanent environmental effect in the model even with a modest proportion of repeated records, given the amount of occasion-to-occasion variability observed in methane measurements; omitting it would risk attributing repeatable but non-genetic variation to the additive genetic variance. We report repeatability alongside heritability for every trait for which the permanent environmental variance could be estimated and note directly in the results where it could not (itself a further indication of how sparse repeated </w:t>
+      </w:r>
+      <w:r>
+        <w:lastRenderedPageBreak/>
+        <w:t>records limit what can be estimated for some of the smaller trait subsets, such as the CT-derived traits). [Revised manuscript, lines 66–73, 522–525.]</w:t>
       </w:r>
     </w:p>
     <w:p>
@@ -677,18 +926,18 @@
         <w:rPr>
           <w:i/>
         </w:rPr>
+        <w:t>At last - there are other studies showing differences between growing and adult animals in their physiology and therefore also in their methane emissions. Did you consider splitting the dataset into different groups? That might affect your results.</w:t>
+      </w:r>
+    </w:p>
+    <w:p>
+      <w:pPr>
+        <w:jc w:val="both"/>
+      </w:pPr>
+      <w:r>
+        <w:rPr>
+          <w:b/>
+        </w:rPr>
         <w:lastRenderedPageBreak/>
-        <w:t>At last - there are other studies showing differences between growing and adult animals in their physiology and therefore also in their methane emissions. Did you consider splitting the dataset into different groups? That might affect your results.</w:t>
-      </w:r>
-    </w:p>
-    <w:p>
-      <w:pPr>
-        <w:jc w:val="both"/>
-      </w:pPr>
-      <w:r>
-        <w:rPr>
-          <w:b/>
-        </w:rPr>
         <w:t>Response:</w:t>
       </w:r>
       <w:r>
@@ -770,7 +1019,13 @@
         <w:t>Response:</w:t>
       </w:r>
       <w:r>
-        <w:t xml:space="preserve"> We thank the reviewer for this suggestion. We have retained the notation g day⁻¹, as it follows SI convention and remains unambiguous for the compound units used throughout the manuscript (e.g. g day⁻¹ kg⁻⁰·⁷⁵ for CH4/MBW and g day⁻¹ L⁻¹ for CH4/rumen), which would be harder to read with slashes. We are happy to change this if the journal style requires.</w:t>
+        <w:t xml:space="preserve"> We thank the reviewer for this suggestion. We have retained the notation g day⁻¹, as it follows SI convention and remains unambiguous for the compound units used throughout the manuscript (e.g. g day⁻¹ kg⁻⁰·⁷⁵ for CH4/MBW and g day⁻¹ L⁻¹ for CH4/rumen), which would be harder to read with </w:t>
+      </w:r>
+      <w:r>
+        <w:t>“/”</w:t>
+      </w:r>
+      <w:r>
+        <w:t>. We are happy to change this if the journal style requires.</w:t>
       </w:r>
     </w:p>
     <w:p>
@@ -837,11 +1092,187 @@
         <w:rPr>
           <w:b/>
         </w:rPr>
+        <w:t>Response:</w:t>
+      </w:r>
+      <w:r>
+        <w:t xml:space="preserve"> The sentence now states that agriculture is the largest single sector source of Ireland’s national greenhouse gas emissions, with methane from enteric fermentation in cattle and sheep the dominant gas (Background). [Revised manuscript, lines 54–56.]</w:t>
+      </w:r>
+    </w:p>
+    <w:p>
+      <w:pPr>
+        <w:jc w:val="both"/>
+      </w:pPr>
+      <w:r>
+        <w:rPr>
+          <w:b/>
+          <w:i/>
+        </w:rPr>
+        <w:lastRenderedPageBreak/>
+        <w:t>Line 73:</w:t>
+      </w:r>
+      <w:r>
+        <w:t xml:space="preserve"> </w:t>
+      </w:r>
+      <w:r>
+        <w:rPr>
+          <w:i/>
+        </w:rPr>
+        <w:t>How is that? I would recommend you to explain this statement, or to remove it in order to avoid confusion.</w:t>
+      </w:r>
+    </w:p>
+    <w:p>
+      <w:pPr>
+        <w:jc w:val="both"/>
+      </w:pPr>
+      <w:r>
+        <w:rPr>
+          <w:b/>
+        </w:rPr>
+        <w:t>Response:</w:t>
+      </w:r>
+      <w:r>
+        <w:t xml:space="preserve"> The statement on Ireland’s carbon efficiency is now explained as being on a per-kilogram-of-product basis and cited [5, 6], and is linked to the need for mitigation that does not reduce productivity (Background). [Revised manuscript, lines 56–58.]</w:t>
+      </w:r>
+    </w:p>
+    <w:p>
+      <w:pPr>
+        <w:jc w:val="both"/>
+      </w:pPr>
+      <w:r>
+        <w:rPr>
+          <w:b/>
+          <w:i/>
+        </w:rPr>
+        <w:t>Line 84-85:</w:t>
+      </w:r>
+      <w:r>
+        <w:t xml:space="preserve"> </w:t>
+      </w:r>
+      <w:r>
+        <w:rPr>
+          <w:i/>
+        </w:rPr>
+        <w:t>I would generally recommend you do define in the beginning what you mean with methane production, methane emission and so on. Methane emissions can also include those from manure, but as you mean the ones from enteric fermentation I would recommend you to specify this in the beginning.</w:t>
+      </w:r>
+    </w:p>
+    <w:p>
+      <w:pPr>
+        <w:jc w:val="both"/>
+      </w:pPr>
+      <w:r>
+        <w:rPr>
+          <w:b/>
+        </w:rPr>
+        <w:t>Response:</w:t>
+      </w:r>
+      <w:r>
+        <w:t xml:space="preserve"> Enteric methane is now specified at first use in the Background (“Enteric methane emissions (hereafter referred to as methane emissions), produced during rumen fermentation…”), so that methane from manure management is not implied. The Methods (Absolute Methane Production) restates this as the methane captured by PAC measurement. [Revised manuscript, lines 47–48, 163–164.]</w:t>
+      </w:r>
+    </w:p>
+    <w:p>
+      <w:pPr>
+        <w:jc w:val="both"/>
+      </w:pPr>
+      <w:r>
+        <w:rPr>
+          <w:b/>
+          <w:i/>
+        </w:rPr>
+        <w:t>Line 154:</w:t>
+      </w:r>
+      <w:r>
+        <w:t xml:space="preserve"> </w:t>
+      </w:r>
+      <w:r>
+        <w:rPr>
+          <w:i/>
+        </w:rPr>
+        <w:t>Charolais with only one "l".</w:t>
+      </w:r>
+    </w:p>
+    <w:p>
+      <w:pPr>
+        <w:jc w:val="both"/>
+      </w:pPr>
+      <w:r>
+        <w:rPr>
+          <w:b/>
+        </w:rPr>
+        <w:t>Response:</w:t>
+      </w:r>
+      <w:r>
+        <w:t xml:space="preserve"> Corrected to “Charolais” throughout; the misspelling “Llyen” in the same sentence has also been corrected to “Lleyn”. [Revised manuscript, lines 143–144.]</w:t>
+      </w:r>
+    </w:p>
+    <w:p>
+      <w:pPr>
+        <w:jc w:val="both"/>
+      </w:pPr>
+      <w:r>
+        <w:rPr>
+          <w:b/>
+          <w:i/>
+        </w:rPr>
+        <w:t>Line 164:</w:t>
+      </w:r>
+      <w:r>
+        <w:t xml:space="preserve"> </w:t>
+      </w:r>
+      <w:r>
+        <w:rPr>
+          <w:i/>
+        </w:rPr>
+        <w:t>You consistently call these traits "alternative" definitions, but I would recommend you to call them "different" or something similar, as I always remain asking myself alternative to what?</w:t>
+      </w:r>
+    </w:p>
+    <w:p>
+      <w:pPr>
+        <w:jc w:val="both"/>
+      </w:pPr>
+      <w:r>
+        <w:rPr>
+          <w:b/>
+        </w:rPr>
+        <w:t>Response:</w:t>
+      </w:r>
+      <w:r>
+        <w:t xml:space="preserve"> We have kept the term “alternative”, as it is widely used for these traits in the literature, but it is now defined where the traits are introduced in the Methods (Methane trait definitions): “alternative” refers to traits expressed relative to production or as residuals, rather than as daily (absolute) methane alone. [Revised manuscript, lines 158–161.]</w:t>
+      </w:r>
+    </w:p>
+    <w:p>
+      <w:pPr>
+        <w:jc w:val="both"/>
+      </w:pPr>
+      <w:r>
+        <w:rPr>
+          <w:b/>
+          <w:i/>
+        </w:rPr>
+        <w:t>Line 195:</w:t>
+      </w:r>
+      <w:r>
+        <w:t xml:space="preserve"> </w:t>
+      </w:r>
+      <w:r>
+        <w:rPr>
+          <w:i/>
+        </w:rPr>
+        <w:t>How many sires did you have and how complete was the pedigree for all animals?</w:t>
+      </w:r>
+    </w:p>
+    <w:p>
+      <w:pPr>
+        <w:jc w:val="both"/>
+      </w:pPr>
+      <w:r>
+        <w:rPr>
+          <w:b/>
+        </w:rPr>
         <w:lastRenderedPageBreak/>
         <w:t>Response:</w:t>
       </w:r>
       <w:r>
-        <w:t xml:space="preserve"> The sentence now states that agriculture is the largest single sector source of Ireland’s national greenhouse gas emissions, with methane from enteric fermentation in cattle and sheep the dominant gas (Background). [Revised manuscript, lines 54–56.]</w:t>
+        <w:t xml:space="preserve"> The Methods (Genetic analysis) now state the pedigree size (36,449 animals), the number of unique sires (1,025), pedigree completeness (100% of phenotyped animals in the pedigree; 88.5% with both parents known), mean pedigree depth (17.6 generations) and sire connectedness (73.1% of sires linked two or more contemporary groups). [Revised manuscript, lines 185–190, 610.]</w:t>
       </w:r>
     </w:p>
     <w:p>
@@ -853,7 +1284,7 @@
           <w:b/>
           <w:i/>
         </w:rPr>
-        <w:t>Line 73:</w:t>
+        <w:t>Line 202 ff:</w:t>
       </w:r>
       <w:r>
         <w:t xml:space="preserve"> </w:t>
@@ -862,7 +1293,7 @@
         <w:rPr>
           <w:i/>
         </w:rPr>
-        <w:t>How is that? I would recommend you to explain this statement, or to remove it in order to avoid confusion.</w:t>
+        <w:t>"sex" and the other effects in the model should also be cursive when referring to the model.</w:t>
       </w:r>
     </w:p>
     <w:p>
@@ -876,7 +1307,7 @@
         <w:t>Response:</w:t>
       </w:r>
       <w:r>
-        <w:t xml:space="preserve"> The statement on Ireland’s carbon efficiency is now explained as being on a per-kilogram-of-product basis and cited [5, 6], and is linked to the need for mitigation that does not reduce productivity (Background). [Revised manuscript, lines 56–58.]</w:t>
+        <w:t xml:space="preserve"> All model terms (sex, BR to TX, UN, het, rec, age, BTg, RTg, BTe, RTe, DP, CG, a, pe and e) are now italicised in the model definitions (Methods, Genetic analysis). [Revised manuscript, lines 194–210.]</w:t>
       </w:r>
     </w:p>
     <w:p>
@@ -888,7 +1319,7 @@
           <w:b/>
           <w:i/>
         </w:rPr>
-        <w:t>Line 84-85:</w:t>
+        <w:t>Line 213:</w:t>
       </w:r>
       <w:r>
         <w:t xml:space="preserve"> </w:t>
@@ -897,7 +1328,7 @@
         <w:rPr>
           <w:i/>
         </w:rPr>
-        <w:t>I would generally recommend you do define in the beginning what you mean with methane production, methane emission and so on. Methane emissions can also include those from manure, but as you mean the ones from enteric fermentation I would recommend you to specify this in the beginning.</w:t>
+        <w:t>You stated initially that only about 25% of you animals have repeated records and though, you apply a permanent environmental effect. Did you other techniques?</w:t>
       </w:r>
     </w:p>
     <w:p>
@@ -911,7 +1342,7 @@
         <w:t>Response:</w:t>
       </w:r>
       <w:r>
-        <w:t xml:space="preserve"> Enteric methane is now specified at first use in the Background (“Enteric methane emissions (hereafter referred to as methane emissions), produced during rumen fermentation…”), so that methane from manure management is not implied. The Methods (Absolute Methane Production) restates this as the methane captured by PAC measurement. [Revised manuscript, lines 47–48, 163–164.]</w:t>
+        <w:t xml:space="preserve"> See our response above on repeated records. Given the substantial occasion-to-occasion variability of single short PAC measurements, we did not consider a model without the permanent environmental effect to be appropriate, even with about a quarter of animals having repeated records. Omitting it would attribute repeatable but non-genetic variation to the additive genetic variance, inflating heritability, and would not allow repeatability to be estimated, which is itself an important parameter for PAC-based methane phenotypes. The animal permanent environmental effect is therefore retained in the model, and repeatability is reported alongside heritability (Table 2). The limited number of repeated records per animal is now stated as a limitation. [Revised manuscript, lines 522–525.]</w:t>
       </w:r>
     </w:p>
     <w:p>
@@ -923,7 +1354,7 @@
           <w:b/>
           <w:i/>
         </w:rPr>
-        <w:t>Line 154:</w:t>
+        <w:t>Line 297:</w:t>
       </w:r>
       <w:r>
         <w:t xml:space="preserve"> </w:t>
@@ -932,7 +1363,7 @@
         <w:rPr>
           <w:i/>
         </w:rPr>
-        <w:t>Charolais with only one "l".</w:t>
+        <w:t>You did not introduce the CH4/CO2 ratio as a trait in your method section.</w:t>
       </w:r>
     </w:p>
     <w:p>
@@ -946,7 +1377,11 @@
         <w:t>Response:</w:t>
       </w:r>
       <w:r>
-        <w:t xml:space="preserve"> Corrected to “Charolais” throughout; the misspelling “Llyen” in the same sentence has also been corrected to “Lleyn”. [Revised manuscript, lines 143–144.]</w:t>
+        <w:t xml:space="preserve"> The trait at line 297 is CH4 ratio, which is CH4/(CH4 + CO2) rather than CH4/CO2. It was defined in the submitted Methods (Ratio-Based Methane Traits), but we have now made </w:t>
+      </w:r>
+      <w:r>
+        <w:lastRenderedPageBreak/>
+        <w:t>the definition more explicit there, stating the formula, its units (g day⁻¹ for both gases) and that it is calculated on a mass basis. [Revised manuscript, lines 170–171.]</w:t>
       </w:r>
     </w:p>
     <w:p>
@@ -958,7 +1393,7 @@
           <w:b/>
           <w:i/>
         </w:rPr>
-        <w:t>Line 164:</w:t>
+        <w:t>Line 304:</w:t>
       </w:r>
       <w:r>
         <w:t xml:space="preserve"> </w:t>
@@ -967,7 +1402,7 @@
         <w:rPr>
           <w:i/>
         </w:rPr>
-        <w:t>You consistently call these traits "alternative" definitions, but I would recommend you to call them "different" or something similar, as I always remain asking myself alternative to what?</w:t>
+        <w:t>Why are there two numbers for CH4 ratio?</w:t>
       </w:r>
     </w:p>
     <w:p>
@@ -981,11 +1416,7 @@
         <w:t>Response:</w:t>
       </w:r>
       <w:r>
-        <w:t xml:space="preserve"> We have kept the term “alternative”, as it is widely used for these traits in the literature, but it is now defined where the traits are introduced in the Methods (Methane trait </w:t>
-      </w:r>
-      <w:r>
-        <w:lastRenderedPageBreak/>
-        <w:t>definitions): “alternative” refers to traits expressed relative to production or as residuals, rather than as daily (absolute) methane alone. [Revised manuscript, lines 158–161.]</w:t>
+        <w:t xml:space="preserve"> In the submitted Table 2, the standard errors of σa and σpe for CH4 ratio (1.23×10⁻⁴ and 2.90×10⁻⁵) wrapped onto a second line, which made the row appear to give two sets of values. Table 2 has been reformatted so that each trait occupies a single row, and CVa is no longer reported for CH4 ratio. The manuscript now reports a single heritability and repeatability for CH4 ratio, 0.19 and 0.32, from the model with residual variance allowed to differ across contemporary-group-mean classes (Table 2). For the reviewer’s information, the estimate under a single homogeneous residual variance was 0.10 ± 0.01. [Revised manuscript, lines 335–337.]</w:t>
       </w:r>
     </w:p>
     <w:p>
@@ -997,7 +1428,7 @@
           <w:b/>
           <w:i/>
         </w:rPr>
-        <w:t>Line 195:</w:t>
+        <w:t>Line 304:</w:t>
       </w:r>
       <w:r>
         <w:t xml:space="preserve"> </w:t>
@@ -1006,7 +1437,7 @@
         <w:rPr>
           <w:i/>
         </w:rPr>
-        <w:t>How many sires did you have and how complete was the pedigree for all animals?</w:t>
+        <w:t>I would like you to introduce how you calculated repeateabilities and heritabilities in the methods section. Just for completeness of this section.</w:t>
       </w:r>
     </w:p>
     <w:p>
@@ -1020,7 +1451,7 @@
         <w:t>Response:</w:t>
       </w:r>
       <w:r>
-        <w:t xml:space="preserve"> The Methods (Genetic analysis) now state the pedigree size (36,449 animals), the number of unique sires (1,025), pedigree completeness (100% of phenotyped animals in the pedigree; 88.5% with both parents known), mean pedigree depth (17.6 generations) and sire connectedness (73.1% of sires linked two or more contemporary groups). [Revised manuscript, lines 185–190, 610.]</w:t>
+        <w:t xml:space="preserve"> The formulas are now given as displayed equations in the Methods (Genetic analysis): h² = σ²ₐ / (σ²ₐ + σ²ₚₑ + σ²ₑ) and t = (σ²ₐ + σ²ₚₑ) / (σ²ₐ + σ²ₚₑ + σ²ₑ), with the terms as defined for the model. [Revised manuscript, lines 227–229.]</w:t>
       </w:r>
     </w:p>
     <w:p>
@@ -1032,7 +1463,7 @@
           <w:b/>
           <w:i/>
         </w:rPr>
-        <w:t>Line 202 ff:</w:t>
+        <w:t>Line 499:</w:t>
       </w:r>
       <w:r>
         <w:t xml:space="preserve"> </w:t>
@@ -1041,7 +1472,7 @@
         <w:rPr>
           <w:i/>
         </w:rPr>
-        <w:t>"sex" and the other effects in the model should also be cursive when referring to the model.</w:t>
+        <w:t>This might also be because you have a phenotypical residual methane trait, not one that is genetically independent of the traits it is regressed on. Might be noteworthy to address that.</w:t>
       </w:r>
     </w:p>
     <w:p>
@@ -1055,186 +1486,7 @@
         <w:t>Response:</w:t>
       </w:r>
       <w:r>
-        <w:t xml:space="preserve"> All model terms (sex, BR to TX, UN, het, rec, age, BTg, RTg, BTe, RTe, DP, CG, a, pe and e) are now italicised in the model definitions (Methods, Genetic analysis). [Revised manuscript, lines 194–210.]</w:t>
-      </w:r>
-    </w:p>
-    <w:p>
-      <w:pPr>
-        <w:jc w:val="both"/>
-      </w:pPr>
-      <w:r>
-        <w:rPr>
-          <w:b/>
-          <w:i/>
-        </w:rPr>
-        <w:t>Line 213:</w:t>
-      </w:r>
-      <w:r>
-        <w:t xml:space="preserve"> </w:t>
-      </w:r>
-      <w:r>
-        <w:rPr>
-          <w:i/>
-        </w:rPr>
-        <w:t>You stated initially that only about 25% of you animals have repeated records and though, you apply a permanent environmental effect. Did you other techniques?</w:t>
-      </w:r>
-    </w:p>
-    <w:p>
-      <w:pPr>
-        <w:jc w:val="both"/>
-      </w:pPr>
-      <w:r>
-        <w:rPr>
-          <w:b/>
-        </w:rPr>
-        <w:t>Response:</w:t>
-      </w:r>
-      <w:r>
-        <w:t xml:space="preserve"> See our response above on repeated records. Given the substantial occasion-to-occasion variability of single short PAC measurements, we did not consider a model without the permanent environmental effect to be appropriate, even with about a quarter of animals having repeated records. Omitting it would attribute repeatable but non-genetic variation to the additive genetic variance, inflating heritability, and would not allow repeatability to be estimated, which is itself an important parameter for PAC-based methane phenotypes. The animal permanent environmental effect is therefore retained in the model, and repeatability is reported alongside heritability (Table 2). The limited number of repeated records per animal is now stated as a limitation. [Revised manuscript, lines 522–525.]</w:t>
-      </w:r>
-    </w:p>
-    <w:p>
-      <w:pPr>
-        <w:jc w:val="both"/>
-      </w:pPr>
-      <w:r>
-        <w:rPr>
-          <w:b/>
-          <w:i/>
-        </w:rPr>
-        <w:t>Line 297:</w:t>
-      </w:r>
-      <w:r>
-        <w:t xml:space="preserve"> </w:t>
-      </w:r>
-      <w:r>
-        <w:rPr>
-          <w:i/>
-        </w:rPr>
-        <w:t>You did not introduce the CH4/CO2 ratio as a trait in your method section.</w:t>
-      </w:r>
-    </w:p>
-    <w:p>
-      <w:pPr>
-        <w:jc w:val="both"/>
-      </w:pPr>
-      <w:r>
-        <w:rPr>
-          <w:b/>
-        </w:rPr>
-        <w:lastRenderedPageBreak/>
-        <w:t>Response:</w:t>
-      </w:r>
-      <w:r>
-        <w:t xml:space="preserve"> The trait at line 297 is CH4 ratio, which is CH4/(CH4 + CO2) rather than CH4/CO2. It was defined in the submitted Methods (Ratio-Based Methane Traits), but we have now made the definition more explicit there, stating the formula, its units (g day⁻¹ for both gases) and that it is calculated on a mass basis. [Revised manuscript, lines 170–171.]</w:t>
-      </w:r>
-    </w:p>
-    <w:p>
-      <w:pPr>
-        <w:jc w:val="both"/>
-      </w:pPr>
-      <w:r>
-        <w:rPr>
-          <w:b/>
-          <w:i/>
-        </w:rPr>
-        <w:t>Line 304:</w:t>
-      </w:r>
-      <w:r>
-        <w:t xml:space="preserve"> </w:t>
-      </w:r>
-      <w:r>
-        <w:rPr>
-          <w:i/>
-        </w:rPr>
-        <w:t>Why are there two numbers for CH4 ratio?</w:t>
-      </w:r>
-    </w:p>
-    <w:p>
-      <w:pPr>
-        <w:jc w:val="both"/>
-      </w:pPr>
-      <w:r>
-        <w:rPr>
-          <w:b/>
-        </w:rPr>
-        <w:t>Response:</w:t>
-      </w:r>
-      <w:r>
-        <w:t xml:space="preserve"> In the submitted Table 2, the standard errors of σa and σpe for CH4 ratio (1.23×10⁻⁴ and 2.90×10⁻⁵) wrapped onto a second line, which made the row appear to give two sets of values. Table 2 has been reformatted so that each trait occupies a single row, and CVa is no longer reported for CH4 ratio. The manuscript now reports a single heritability and repeatability for CH4 ratio, 0.19 and 0.32, from the model with residual variance allowed to differ across contemporary-group-mean classes (Table 2). For the reviewer’s information, the estimate under a single homogeneous residual variance was 0.10 ± 0.01. [Revised manuscript, lines 335–337.]</w:t>
-      </w:r>
-    </w:p>
-    <w:p>
-      <w:pPr>
-        <w:jc w:val="both"/>
-      </w:pPr>
-      <w:r>
-        <w:rPr>
-          <w:b/>
-          <w:i/>
-        </w:rPr>
-        <w:t>Line 304:</w:t>
-      </w:r>
-      <w:r>
-        <w:t xml:space="preserve"> </w:t>
-      </w:r>
-      <w:r>
-        <w:rPr>
-          <w:i/>
-        </w:rPr>
-        <w:t>I would like you to introduce how you calculated repeateabilities and heritabilities in the methods section. Just for completeness of this section.</w:t>
-      </w:r>
-    </w:p>
-    <w:p>
-      <w:pPr>
-        <w:jc w:val="both"/>
-      </w:pPr>
-      <w:r>
-        <w:rPr>
-          <w:b/>
-        </w:rPr>
-        <w:t>Response:</w:t>
-      </w:r>
-      <w:r>
-        <w:t xml:space="preserve"> The formulas are now given as displayed equations in the Methods (Genetic analysis): h² = σ²ₐ / (σ²ₐ + σ²ₚₑ + σ²ₑ) and t = (σ²ₐ + σ²ₚₑ) / (σ²ₐ + σ²ₚₑ + σ²ₑ), with the terms as defined for the model. [Revised manuscript, lines 227–229.]</w:t>
-      </w:r>
-    </w:p>
-    <w:p>
-      <w:pPr>
-        <w:jc w:val="both"/>
-      </w:pPr>
-      <w:r>
-        <w:rPr>
-          <w:b/>
-          <w:i/>
-        </w:rPr>
-        <w:t>Line 499:</w:t>
-      </w:r>
-      <w:r>
-        <w:t xml:space="preserve"> </w:t>
-      </w:r>
-      <w:r>
-        <w:rPr>
-          <w:i/>
-        </w:rPr>
-        <w:t>This might also be because you have a phenotypical residual methane trait, not one that is genetically independent of the traits it is regressed on. Might be noteworthy to address that.</w:t>
-      </w:r>
-    </w:p>
-    <w:p>
-      <w:pPr>
-        <w:jc w:val="both"/>
-      </w:pPr>
-      <w:r>
-        <w:rPr>
-          <w:b/>
-        </w:rPr>
-        <w:t>Response:</w:t>
-      </w:r>
-      <w:r>
-        <w:t xml:space="preserve"> The Discussion now notes that the residual traits remain strongly genetically correlated with absolute methane (rg = 0.78–1.00), consistent with the general statistical behaviour of residual variables; that is, a phenotypic residual is not genetically independent of the traits it is regressed on. The index analysis adds that a residual is a fixed weighting of </w:t>
-      </w:r>
-      <w:r>
-        <w:t>methane against the adjustment traits (Discussion). [Revised manuscript, lines 499–501, 532–535.]</w:t>
+        <w:t xml:space="preserve"> The Discussion now notes that the residual traits remain strongly genetically correlated with absolute methane (rg = 0.78–1.00), consistent with the general statistical behaviour of residual variables; that is, a phenotypic residual is not genetically independent of the traits it is regressed on. The index analysis adds that a residual is a fixed weighting of methane against the adjustment traits (Discussion). [Revised manuscript, lines 499–501, 532–535.]</w:t>
       </w:r>
     </w:p>
     <w:sectPr>
@@ -1329,7 +1581,7 @@
       </w:r>
     </w:p>
   </w:comment>
-  <w:comment w:id="5" w:author="Claude" w:date="2026-10-21T22:13:00Z" w:initials="C">
+  <w:comment w:id="5" w:author="Dermot Kelly" w:date="2026-10-22T15:48:00Z" w:initials="DK">
     <w:p>
       <w:pPr>
         <w:pStyle w:val="CommentText"/>
@@ -1341,51 +1593,27 @@
         <w:annotationRef/>
       </w:r>
       <w:r>
-        <w:t>Change note: 'and independently verified' removed.</w:t>
-      </w:r>
-    </w:p>
+        <w:t xml:space="preserve">Shortened this section </w:t>
+      </w:r>
+    </w:p>
+  </w:comment>
+  <w:comment w:id="6" w:author="Dermot Kelly" w:date="2026-10-22T15:49:00Z" w:initials="DK">
     <w:p>
       <w:pPr>
         <w:pStyle w:val="CommentText"/>
       </w:pPr>
       <w:r>
-        <w:t>Claude: “how the genetic-parameter analysis was conducted”</w:t>
+        <w:rPr>
+          <w:rStyle w:val="CommentReference"/>
+        </w:rPr>
+        <w:annotationRef/>
+      </w:r>
+      <w:r>
+        <w:t>I also now note in the discussion that the chances of having large scale feed intake records are slim</w:t>
       </w:r>
     </w:p>
   </w:comment>
-  <w:comment w:id="6" w:author="Dermot Kelly" w:date="2026-10-22T15:48:00Z" w:initials="DK">
-    <w:p>
-      <w:pPr>
-        <w:pStyle w:val="CommentText"/>
-      </w:pPr>
-      <w:r>
-        <w:rPr>
-          <w:rStyle w:val="CommentReference"/>
-        </w:rPr>
-        <w:annotationRef/>
-      </w:r>
-      <w:r>
-        <w:t xml:space="preserve">Shortened this section </w:t>
-      </w:r>
-    </w:p>
-  </w:comment>
-  <w:comment w:id="7" w:author="Dermot Kelly" w:date="2026-10-22T15:49:00Z" w:initials="DK">
-    <w:p>
-      <w:pPr>
-        <w:pStyle w:val="CommentText"/>
-      </w:pPr>
-      <w:r>
-        <w:rPr>
-          <w:rStyle w:val="CommentReference"/>
-        </w:rPr>
-        <w:annotationRef/>
-      </w:r>
-      <w:r>
-        <w:t>I also now note in the discussion that the chances of having large scale feed intake records are slim</w:t>
-      </w:r>
-    </w:p>
-  </w:comment>
-  <w:comment w:id="8" w:author="Dermot Kelly" w:date="2026-10-22T15:50:00Z" w:initials="DK">
+  <w:comment w:id="7" w:author="Dermot Kelly" w:date="2026-10-22T15:50:00Z" w:initials="DK">
     <w:p>
       <w:pPr>
         <w:pStyle w:val="CommentText"/>
@@ -1411,7 +1639,6 @@
   <w15:commentEx w15:paraId="2492CA9E" w15:done="0"/>
   <w15:commentEx w15:paraId="59196487" w15:done="0"/>
   <w15:commentEx w15:paraId="42538062" w15:done="0"/>
-  <w15:commentEx w15:paraId="36799426" w15:done="0"/>
   <w15:commentEx w15:paraId="277893CC" w15:done="0"/>
   <w15:commentEx w15:paraId="7B3A3476" w15:done="0"/>
   <w15:commentEx w15:paraId="37F6E47C" w15:done="0"/>
@@ -1438,7 +1665,6 @@
   <w16cid:commentId w16cid:paraId="2492CA9E" w16cid:durableId="667AFC9A"/>
   <w16cid:commentId w16cid:paraId="59196487" w16cid:durableId="31C98D88"/>
   <w16cid:commentId w16cid:paraId="42538062" w16cid:durableId="7BC71A05"/>
-  <w16cid:commentId w16cid:paraId="36799426" w16cid:durableId="36799426"/>
   <w16cid:commentId w16cid:paraId="277893CC" w16cid:durableId="1501732D"/>
   <w16cid:commentId w16cid:paraId="7B3A3476" w16cid:durableId="4AFA3B1D"/>
   <w16cid:commentId w16cid:paraId="37F6E47C" w16cid:durableId="28935797"/>
@@ -8056,6 +8282,27 @@
 </file>
 
 <file path=customXml/item1.xml><?xml version="1.0" encoding="utf-8"?>
+<?mso-contentType ?>
+<FormTemplates xmlns="http://schemas.microsoft.com/sharepoint/v3/contenttype/forms">
+  <Display>DocumentLibraryForm</Display>
+  <Edit>DocumentLibraryForm</Edit>
+  <New>DocumentLibraryForm</New>
+</FormTemplates>
+</file>
+
+<file path=customXml/item2.xml><?xml version="1.0" encoding="utf-8"?>
+<b:Sources xmlns:b="http://schemas.openxmlformats.org/officeDocument/2006/bibliography" xmlns="http://schemas.openxmlformats.org/officeDocument/2006/bibliography" SelectedStyle="\APASixthEditionOfficeOnline.xsl" StyleName="APA" Version="6"/>
+</file>
+
+<file path=customXml/item3.xml><?xml version="1.0" encoding="utf-8"?>
+<p:properties xmlns:p="http://schemas.microsoft.com/office/2006/metadata/properties" xmlns:xsi="http://www.w3.org/2001/XMLSchema-instance" xmlns:pc="http://schemas.microsoft.com/office/infopath/2007/PartnerControls">
+  <documentManagement>
+    <_activity xmlns="b84a64d9-e0b9-4ebc-9dbe-ba7382209046" xsi:nil="true"/>
+  </documentManagement>
+</p:properties>
+</file>
+
+<file path=customXml/item4.xml><?xml version="1.0" encoding="utf-8"?>
 <ct:contentTypeSchema xmlns:ct="http://schemas.microsoft.com/office/2006/metadata/contentType" xmlns:ma="http://schemas.microsoft.com/office/2006/metadata/properties/metaAttributes" ct:_="" ma:_="" ma:contentTypeName="Document" ma:contentTypeID="0x010100596EC69E7A4E72499483E6F02B4AFB81" ma:contentTypeVersion="15" ma:contentTypeDescription="Create a new document." ma:contentTypeScope="" ma:versionID="bc8852126371099ae99c8aa34652dae9">
   <xsd:schema xmlns:xsd="http://www.w3.org/2001/XMLSchema" xmlns:xs="http://www.w3.org/2001/XMLSchema" xmlns:p="http://schemas.microsoft.com/office/2006/metadata/properties" xmlns:ns3="74bd1280-7bf8-41ca-a28a-063f53dd333e" xmlns:ns4="b84a64d9-e0b9-4ebc-9dbe-ba7382209046" targetNamespace="http://schemas.microsoft.com/office/2006/metadata/properties" ma:root="true" ma:fieldsID="c3bc438b50810b1abee84e82e1b3ed7a" ns3:_="" ns4:_="">
     <xsd:import namespace="74bd1280-7bf8-41ca-a28a-063f53dd333e"/>
@@ -8286,28 +8533,33 @@
 </ct:contentTypeSchema>
 </file>
 
-<file path=customXml/item2.xml><?xml version="1.0" encoding="utf-8"?>
-<p:properties xmlns:p="http://schemas.microsoft.com/office/2006/metadata/properties" xmlns:xsi="http://www.w3.org/2001/XMLSchema-instance" xmlns:pc="http://schemas.microsoft.com/office/infopath/2007/PartnerControls">
-  <documentManagement>
-    <_activity xmlns="b84a64d9-e0b9-4ebc-9dbe-ba7382209046" xsi:nil="true"/>
-  </documentManagement>
-</p:properties>
+<file path=customXml/itemProps1.xml><?xml version="1.0" encoding="utf-8"?>
+<ds:datastoreItem xmlns:ds="http://schemas.openxmlformats.org/officeDocument/2006/customXml" ds:itemID="{A0FFA8C9-46C6-485C-8D0D-FE16A4EE410F}">
+  <ds:schemaRefs>
+    <ds:schemaRef ds:uri="http://schemas.microsoft.com/sharepoint/v3/contenttype/forms"/>
+  </ds:schemaRefs>
+</ds:datastoreItem>
 </file>
 
-<file path=customXml/item3.xml><?xml version="1.0" encoding="utf-8"?>
-<b:Sources xmlns:b="http://schemas.openxmlformats.org/officeDocument/2006/bibliography" xmlns="http://schemas.openxmlformats.org/officeDocument/2006/bibliography" SelectedStyle="\APASixthEditionOfficeOnline.xsl" StyleName="APA" Version="6"/>
+<file path=customXml/itemProps2.xml><?xml version="1.0" encoding="utf-8"?>
+<ds:datastoreItem xmlns:ds="http://schemas.openxmlformats.org/officeDocument/2006/customXml" ds:itemID="{2BD4A51E-3639-4226-9642-9F9BBAFC18A4}">
+  <ds:schemaRefs>
+    <ds:schemaRef ds:uri="http://schemas.openxmlformats.org/officeDocument/2006/bibliography"/>
+  </ds:schemaRefs>
+</ds:datastoreItem>
 </file>
 
-<file path=customXml/item4.xml><?xml version="1.0" encoding="utf-8"?>
-<?mso-contentType ?>
-<FormTemplates xmlns="http://schemas.microsoft.com/sharepoint/v3/contenttype/forms">
-  <Display>DocumentLibraryForm</Display>
-  <Edit>DocumentLibraryForm</Edit>
-  <New>DocumentLibraryForm</New>
-</FormTemplates>
+<file path=customXml/itemProps3.xml><?xml version="1.0" encoding="utf-8"?>
+<ds:datastoreItem xmlns:ds="http://schemas.openxmlformats.org/officeDocument/2006/customXml" ds:itemID="{3D966845-37E2-4776-BF6A-084BBD2EF57A}">
+  <ds:schemaRefs>
+    <ds:schemaRef ds:uri="http://schemas.microsoft.com/office/2006/metadata/properties"/>
+    <ds:schemaRef ds:uri="http://schemas.microsoft.com/office/infopath/2007/PartnerControls"/>
+    <ds:schemaRef ds:uri="b84a64d9-e0b9-4ebc-9dbe-ba7382209046"/>
+  </ds:schemaRefs>
+</ds:datastoreItem>
 </file>
 
-<file path=customXml/itemProps1.xml><?xml version="1.0" encoding="utf-8"?>
+<file path=customXml/itemProps4.xml><?xml version="1.0" encoding="utf-8"?>
 <ds:datastoreItem xmlns:ds="http://schemas.openxmlformats.org/officeDocument/2006/customXml" ds:itemID="{80D3ACBB-80B9-477B-8DB0-AC5D11723039}">
   <ds:schemaRefs>
     <ds:schemaRef ds:uri="http://schemas.microsoft.com/office/2006/metadata/contentType"/>
@@ -8324,30 +8576,4 @@
     <ds:schemaRef ds:uri="http://schemas.microsoft.com/internal/obd"/>
   </ds:schemaRefs>
 </ds:datastoreItem>
-</file>
-
-<file path=customXml/itemProps2.xml><?xml version="1.0" encoding="utf-8"?>
-<ds:datastoreItem xmlns:ds="http://schemas.openxmlformats.org/officeDocument/2006/customXml" ds:itemID="{3D966845-37E2-4776-BF6A-084BBD2EF57A}">
-  <ds:schemaRefs>
-    <ds:schemaRef ds:uri="http://schemas.microsoft.com/office/2006/metadata/properties"/>
-    <ds:schemaRef ds:uri="http://schemas.microsoft.com/office/infopath/2007/PartnerControls"/>
-    <ds:schemaRef ds:uri="b84a64d9-e0b9-4ebc-9dbe-ba7382209046"/>
-  </ds:schemaRefs>
-</ds:datastoreItem>
-</file>
-
-<file path=customXml/itemProps3.xml><?xml version="1.0" encoding="utf-8"?>
-<ds:datastoreItem xmlns:ds="http://schemas.openxmlformats.org/officeDocument/2006/customXml" ds:itemID="{2BD4A51E-3639-4226-9642-9F9BBAFC18A4}">
-  <ds:schemaRefs>
-    <ds:schemaRef ds:uri="http://schemas.openxmlformats.org/officeDocument/2006/bibliography"/>
-  </ds:schemaRefs>
-</ds:datastoreItem>
-</file>
-
-<file path=customXml/itemProps4.xml><?xml version="1.0" encoding="utf-8"?>
-<ds:datastoreItem xmlns:ds="http://schemas.openxmlformats.org/officeDocument/2006/customXml" ds:itemID="{A0FFA8C9-46C6-485C-8D0D-FE16A4EE410F}">
-  <ds:schemaRefs>
-    <ds:schemaRef ds:uri="http://schemas.microsoft.com/sharepoint/v3/contenttype/forms"/>
-  </ds:schemaRefs>
-</ds:datastoreItem>
 </file>
</xml_diff>